<commit_message>
refactor: reorganise harnesses into impact-analyser/ and rca/ subdirectories
Move full impact analyser harness (consistency, integrity, reliability,
completeness) from agentic-ai-stlc/testing/ into harnesses/impact-analyser/.
Remove bare stub folders at harnesses root. Structure is now:

  harnesses/impact-analyser/  — original AI Test Impact Analyser harnesses
  harnesses/rca/              — RCA agent harnesses

Ready to add harnesses/new-agent/ for future agents.

Co-Authored-By: Claude Sonnet 4.6 <noreply@anthropic.com>
</commit_message>
<xml_diff>
--- a/reports/RCA_Harness_Report.docx
+++ b/reports/RCA_Harness_Report.docx
@@ -22,7 +22,7 @@
         <w:rPr>
           <w:color w:val="444444"/>
         </w:rPr>
-        <w:t>Generated: 19 October 2026   |   Harnesses: Consistency · Integrity · Reliability · Completeness</w:t>
+        <w:t>Generated: 21 October 2026   |   Harnesses: Consistency · Integrity · Reliability · Completeness</w:t>
       </w:r>
     </w:p>
     <w:p/>
@@ -139,7 +139,7 @@
                 <w:color w:val="007050"/>
                 <w:sz w:val="18"/>
               </w:rPr>
-              <w:t>0.804</w:t>
+              <w:t>0.925</w:t>
             </w:r>
           </w:p>
         </w:tc>
@@ -304,7 +304,7 @@
                 <w:color w:val="007050"/>
                 <w:sz w:val="18"/>
               </w:rPr>
-              <w:t>0.872</w:t>
+              <w:t>0.950</w:t>
             </w:r>
           </w:p>
         </w:tc>
@@ -336,7 +336,7 @@
           <w:color w:val="007050"/>
           <w:sz w:val="22"/>
         </w:rPr>
-        <w:t>Combined average: 0.919 — Good</w:t>
+        <w:t>Combined average: 0.969 — Good</w:t>
       </w:r>
     </w:p>
     <w:p/>
@@ -369,7 +369,7 @@
     </w:p>
     <w:p>
       <w:r>
-        <w:t>Fixture: Typescript Compilation Error   |   Runs: 5/5 completed   |   Overall: 0.804 — Good</w:t>
+        <w:t>Fixture: Four Typescript Errors   |   Runs: 5/5 completed   |   Overall: 0.925 — Good</w:t>
       </w:r>
     </w:p>
     <w:tbl>
@@ -488,10 +488,10 @@
             <w:r>
               <w:rPr>
                 <w:b w:val="0"/>
-                <w:color w:val="BF7F00"/>
+                <w:color w:val="007050"/>
                 <w:sz w:val="18"/>
               </w:rPr>
-              <w:t>0.600 — Fair</w:t>
+              <w:t>1.000 — Excellent</w:t>
             </w:r>
           </w:p>
         </w:tc>
@@ -528,7 +528,7 @@
                 <w:color w:val="BF7F00"/>
                 <w:sz w:val="18"/>
               </w:rPr>
-              <w:t>0.615 — Fair</w:t>
+              <w:t>0.702 — Fair</w:t>
             </w:r>
           </w:p>
         </w:tc>
@@ -602,7 +602,7 @@
                 <w:color w:val="007050"/>
                 <w:sz w:val="18"/>
               </w:rPr>
-              <w:t>0.804 — Good</w:t>
+              <w:t>0.925 — Good</w:t>
             </w:r>
           </w:p>
         </w:tc>
@@ -784,7 +784,7 @@
                 <w:b w:val="0"/>
                 <w:sz w:val="18"/>
               </w:rPr>
-              <w:t>Medium</w:t>
+              <w:t>High</w:t>
             </w:r>
           </w:p>
         </w:tc>
@@ -1054,7 +1054,7 @@
                 <w:b w:val="0"/>
                 <w:sz w:val="18"/>
               </w:rPr>
-              <w:t>Medium</w:t>
+              <w:t>High</w:t>
             </w:r>
           </w:p>
         </w:tc>
@@ -1166,15 +1166,6 @@
       </w:tr>
     </w:tbl>
     <w:p/>
-    <w:p>
-      <w:r>
-        <w:rPr>
-          <w:i/>
-          <w:color w:val="BF7F00"/>
-        </w:rPr>
-        <w:t>Note: severity_agreement is the primary consistency gap. The LLM oscillates between severity levels for ambiguous failures.</w:t>
-      </w:r>
-    </w:p>
     <w:p>
       <w:r>
         <w:br w:type="page"/>
@@ -1859,7 +1850,7 @@
                 <w:b w:val="0"/>
                 <w:sz w:val="18"/>
               </w:rPr>
-              <w:t>The TypeScript compilation failed due to missing type definitions and type misma</w:t>
+              <w:t>The pipeline failed due to multiple TypeScript compilation errors: first, 'ERROR</w:t>
             </w:r>
           </w:p>
         </w:tc>
@@ -1951,7 +1942,7 @@
                 <w:b w:val="0"/>
                 <w:sz w:val="18"/>
               </w:rPr>
-              <w:t>The TypeScript compilation failed due to missing type definitions and type misma</w:t>
+              <w:t>The pipeline failed due to multiple TypeScript compilation errors: 'ERROR: TypeS</w:t>
             </w:r>
           </w:p>
         </w:tc>
@@ -2040,7 +2031,7 @@
                 <w:b w:val="0"/>
                 <w:sz w:val="18"/>
               </w:rPr>
-              <w:t>The TypeScript compilation failed due to missing type definitions and type misma</w:t>
+              <w:t>The pipeline failed due to multiple TypeScript compilation errors: first, 'ERROR</w:t>
             </w:r>
           </w:p>
         </w:tc>
@@ -2132,7 +2123,7 @@
                 <w:b w:val="0"/>
                 <w:sz w:val="18"/>
               </w:rPr>
-              <w:t>The TypeScript compilation failed due to missing ComponentX in src/app/page.tsx.</w:t>
+              <w:t>The pipeline failed due to multiple errors: the TypeScript compilation failed wi</w:t>
             </w:r>
           </w:p>
         </w:tc>
@@ -2221,7 +2212,7 @@
                 <w:b w:val="0"/>
                 <w:sz w:val="18"/>
               </w:rPr>
-              <w:t>The TypeScript compilation failed due to missing type definitions and type misma</w:t>
+              <w:t>The pipeline failed due to multiple TypeScript compilation errors: first, 'ERROR</w:t>
             </w:r>
           </w:p>
         </w:tc>
@@ -2426,7 +2417,7 @@
                 <w:b w:val="0"/>
                 <w:sz w:val="18"/>
               </w:rPr>
-              <w:t>The test 'POST /analyse/cr' failed due to a 500 error instead of the expected 20</w:t>
+              <w:t xml:space="preserve">The test 'should return 202 with run_id' failed because it received a 500 error </w:t>
             </w:r>
           </w:p>
         </w:tc>
@@ -2518,7 +2509,7 @@
                 <w:b w:val="0"/>
                 <w:sz w:val="18"/>
               </w:rPr>
-              <w:t xml:space="preserve">The test 'POST /analyse/cr › should return 202 with run_id' failed due to a 500 </w:t>
+              <w:t>The test 'POST /analyse/cr › should return 202 with run_id' failed because it re</w:t>
             </w:r>
           </w:p>
         </w:tc>
@@ -2607,7 +2598,7 @@
                 <w:b w:val="0"/>
                 <w:sz w:val="18"/>
               </w:rPr>
-              <w:t xml:space="preserve">The test 'POST /analyse/cr › should return 202 with run_id' failed due to a 500 </w:t>
+              <w:t>The test 'POST /analyse/cr' failed because it received a 500 error instead of th</w:t>
             </w:r>
           </w:p>
         </w:tc>
@@ -2699,7 +2690,7 @@
                 <w:b w:val="0"/>
                 <w:sz w:val="18"/>
               </w:rPr>
-              <w:t>The test 'POST /analyse/cr' failed due to a 500 status instead of the expected 2</w:t>
+              <w:t>The pipeline failed due to a test failure in 'src/api/analyse.test.ts' where the</w:t>
             </w:r>
           </w:p>
         </w:tc>
@@ -2788,7 +2779,7 @@
                 <w:b w:val="0"/>
                 <w:sz w:val="18"/>
               </w:rPr>
-              <w:t>The test 'POST /analyse/cr' failed due to a 500 error instead of the expected 20</w:t>
+              <w:t>The test 'POST /analyse/cr' failed because it received a 500 status code instead</w:t>
             </w:r>
           </w:p>
         </w:tc>
@@ -2846,7 +2837,7 @@
     <w:p/>
     <w:p>
       <w:r>
-        <w:t>Fixture: Typescript Compilation Error   |   Runs: 5/5 passed   |   Overall: 0.920 — Good</w:t>
+        <w:t>Fixture: Typescript Compilation Error   |   Runs: 5/5 passed   |   Overall: 1.000 — Excellent</w:t>
       </w:r>
     </w:p>
     <w:tbl>
@@ -2931,7 +2922,7 @@
                 <w:color w:val="007050"/>
                 <w:sz w:val="18"/>
               </w:rPr>
-              <w:t>0.800 — Good</w:t>
+              <w:t>1.000 — Excellent</w:t>
             </w:r>
           </w:p>
         </w:tc>
@@ -3042,7 +3033,7 @@
                 <w:color w:val="007050"/>
                 <w:sz w:val="18"/>
               </w:rPr>
-              <w:t>0.920 — Good</w:t>
+              <w:t>1.000 — Excellent</w:t>
             </w:r>
           </w:p>
         </w:tc>
@@ -3300,6 +3291,993 @@
                 <w:sz w:val="18"/>
               </w:rPr>
               <w:t>1.00</w:t>
+            </w:r>
+          </w:p>
+        </w:tc>
+        <w:tc>
+          <w:tcPr>
+            <w:tcW w:type="dxa" w:w="1234"/>
+          </w:tcPr>
+          <w:p>
+            <w:pPr>
+              <w:jc w:val="center"/>
+            </w:pPr>
+            <w:r>
+              <w:rPr>
+                <w:b/>
+                <w:color w:val="007050"/>
+                <w:sz w:val="18"/>
+              </w:rPr>
+              <w:t>✓</w:t>
+            </w:r>
+          </w:p>
+        </w:tc>
+      </w:tr>
+      <w:tr>
+        <w:tc>
+          <w:tcPr>
+            <w:tcW w:type="dxa" w:w="1234"/>
+            <w:shd w:val="clear" w:color="auto" w:fill="F2F7FF"/>
+          </w:tcPr>
+          <w:p>
+            <w:pPr>
+              <w:jc w:val="center"/>
+            </w:pPr>
+            <w:r>
+              <w:rPr>
+                <w:b w:val="0"/>
+                <w:sz w:val="18"/>
+              </w:rPr>
+              <w:t>2</w:t>
+            </w:r>
+          </w:p>
+        </w:tc>
+        <w:tc>
+          <w:tcPr>
+            <w:tcW w:type="dxa" w:w="1234"/>
+            <w:shd w:val="clear" w:color="auto" w:fill="F2F7FF"/>
+          </w:tcPr>
+          <w:p>
+            <w:pPr>
+              <w:jc w:val="left"/>
+            </w:pPr>
+            <w:r>
+              <w:rPr>
+                <w:b w:val="0"/>
+                <w:sz w:val="18"/>
+              </w:rPr>
+              <w:t>complete</w:t>
+            </w:r>
+          </w:p>
+        </w:tc>
+        <w:tc>
+          <w:tcPr>
+            <w:tcW w:type="dxa" w:w="1234"/>
+            <w:shd w:val="clear" w:color="auto" w:fill="F2F7FF"/>
+          </w:tcPr>
+          <w:p>
+            <w:pPr>
+              <w:jc w:val="center"/>
+            </w:pPr>
+            <w:r>
+              <w:rPr>
+                <w:b w:val="0"/>
+                <w:sz w:val="18"/>
+              </w:rPr>
+              <w:t>1.00</w:t>
+            </w:r>
+          </w:p>
+        </w:tc>
+        <w:tc>
+          <w:tcPr>
+            <w:tcW w:type="dxa" w:w="1234"/>
+            <w:shd w:val="clear" w:color="auto" w:fill="F2F7FF"/>
+          </w:tcPr>
+          <w:p>
+            <w:pPr>
+              <w:jc w:val="center"/>
+            </w:pPr>
+            <w:r>
+              <w:rPr>
+                <w:b w:val="0"/>
+                <w:sz w:val="18"/>
+              </w:rPr>
+              <w:t>1.00</w:t>
+            </w:r>
+          </w:p>
+        </w:tc>
+        <w:tc>
+          <w:tcPr>
+            <w:tcW w:type="dxa" w:w="1234"/>
+            <w:shd w:val="clear" w:color="auto" w:fill="F2F7FF"/>
+          </w:tcPr>
+          <w:p>
+            <w:pPr>
+              <w:jc w:val="center"/>
+            </w:pPr>
+            <w:r>
+              <w:rPr>
+                <w:b w:val="0"/>
+                <w:sz w:val="18"/>
+              </w:rPr>
+              <w:t>1.00</w:t>
+            </w:r>
+          </w:p>
+        </w:tc>
+        <w:tc>
+          <w:tcPr>
+            <w:tcW w:type="dxa" w:w="1234"/>
+            <w:shd w:val="clear" w:color="auto" w:fill="F2F7FF"/>
+          </w:tcPr>
+          <w:p>
+            <w:pPr>
+              <w:jc w:val="center"/>
+            </w:pPr>
+            <w:r>
+              <w:rPr>
+                <w:b w:val="0"/>
+                <w:color w:val="007050"/>
+                <w:sz w:val="18"/>
+              </w:rPr>
+              <w:t>1.00</w:t>
+            </w:r>
+          </w:p>
+        </w:tc>
+        <w:tc>
+          <w:tcPr>
+            <w:tcW w:type="dxa" w:w="1234"/>
+            <w:shd w:val="clear" w:color="auto" w:fill="F2F7FF"/>
+          </w:tcPr>
+          <w:p>
+            <w:pPr>
+              <w:jc w:val="center"/>
+            </w:pPr>
+            <w:r>
+              <w:rPr>
+                <w:b/>
+                <w:color w:val="007050"/>
+                <w:sz w:val="18"/>
+              </w:rPr>
+              <w:t>✓</w:t>
+            </w:r>
+          </w:p>
+        </w:tc>
+      </w:tr>
+      <w:tr>
+        <w:tc>
+          <w:tcPr>
+            <w:tcW w:type="dxa" w:w="1234"/>
+          </w:tcPr>
+          <w:p>
+            <w:pPr>
+              <w:jc w:val="center"/>
+            </w:pPr>
+            <w:r>
+              <w:rPr>
+                <w:b w:val="0"/>
+                <w:sz w:val="18"/>
+              </w:rPr>
+              <w:t>3</w:t>
+            </w:r>
+          </w:p>
+        </w:tc>
+        <w:tc>
+          <w:tcPr>
+            <w:tcW w:type="dxa" w:w="1234"/>
+          </w:tcPr>
+          <w:p>
+            <w:pPr>
+              <w:jc w:val="left"/>
+            </w:pPr>
+            <w:r>
+              <w:rPr>
+                <w:b w:val="0"/>
+                <w:sz w:val="18"/>
+              </w:rPr>
+              <w:t>complete</w:t>
+            </w:r>
+          </w:p>
+        </w:tc>
+        <w:tc>
+          <w:tcPr>
+            <w:tcW w:type="dxa" w:w="1234"/>
+          </w:tcPr>
+          <w:p>
+            <w:pPr>
+              <w:jc w:val="center"/>
+            </w:pPr>
+            <w:r>
+              <w:rPr>
+                <w:b w:val="0"/>
+                <w:sz w:val="18"/>
+              </w:rPr>
+              <w:t>1.00</w:t>
+            </w:r>
+          </w:p>
+        </w:tc>
+        <w:tc>
+          <w:tcPr>
+            <w:tcW w:type="dxa" w:w="1234"/>
+          </w:tcPr>
+          <w:p>
+            <w:pPr>
+              <w:jc w:val="center"/>
+            </w:pPr>
+            <w:r>
+              <w:rPr>
+                <w:b w:val="0"/>
+                <w:sz w:val="18"/>
+              </w:rPr>
+              <w:t>1.00</w:t>
+            </w:r>
+          </w:p>
+        </w:tc>
+        <w:tc>
+          <w:tcPr>
+            <w:tcW w:type="dxa" w:w="1234"/>
+          </w:tcPr>
+          <w:p>
+            <w:pPr>
+              <w:jc w:val="center"/>
+            </w:pPr>
+            <w:r>
+              <w:rPr>
+                <w:b w:val="0"/>
+                <w:sz w:val="18"/>
+              </w:rPr>
+              <w:t>1.00</w:t>
+            </w:r>
+          </w:p>
+        </w:tc>
+        <w:tc>
+          <w:tcPr>
+            <w:tcW w:type="dxa" w:w="1234"/>
+          </w:tcPr>
+          <w:p>
+            <w:pPr>
+              <w:jc w:val="center"/>
+            </w:pPr>
+            <w:r>
+              <w:rPr>
+                <w:b w:val="0"/>
+                <w:color w:val="007050"/>
+                <w:sz w:val="18"/>
+              </w:rPr>
+              <w:t>1.00</w:t>
+            </w:r>
+          </w:p>
+        </w:tc>
+        <w:tc>
+          <w:tcPr>
+            <w:tcW w:type="dxa" w:w="1234"/>
+          </w:tcPr>
+          <w:p>
+            <w:pPr>
+              <w:jc w:val="center"/>
+            </w:pPr>
+            <w:r>
+              <w:rPr>
+                <w:b/>
+                <w:color w:val="007050"/>
+                <w:sz w:val="18"/>
+              </w:rPr>
+              <w:t>✓</w:t>
+            </w:r>
+          </w:p>
+        </w:tc>
+      </w:tr>
+      <w:tr>
+        <w:tc>
+          <w:tcPr>
+            <w:tcW w:type="dxa" w:w="1234"/>
+            <w:shd w:val="clear" w:color="auto" w:fill="F2F7FF"/>
+          </w:tcPr>
+          <w:p>
+            <w:pPr>
+              <w:jc w:val="center"/>
+            </w:pPr>
+            <w:r>
+              <w:rPr>
+                <w:b w:val="0"/>
+                <w:sz w:val="18"/>
+              </w:rPr>
+              <w:t>4</w:t>
+            </w:r>
+          </w:p>
+        </w:tc>
+        <w:tc>
+          <w:tcPr>
+            <w:tcW w:type="dxa" w:w="1234"/>
+            <w:shd w:val="clear" w:color="auto" w:fill="F2F7FF"/>
+          </w:tcPr>
+          <w:p>
+            <w:pPr>
+              <w:jc w:val="left"/>
+            </w:pPr>
+            <w:r>
+              <w:rPr>
+                <w:b w:val="0"/>
+                <w:sz w:val="18"/>
+              </w:rPr>
+              <w:t>complete</w:t>
+            </w:r>
+          </w:p>
+        </w:tc>
+        <w:tc>
+          <w:tcPr>
+            <w:tcW w:type="dxa" w:w="1234"/>
+            <w:shd w:val="clear" w:color="auto" w:fill="F2F7FF"/>
+          </w:tcPr>
+          <w:p>
+            <w:pPr>
+              <w:jc w:val="center"/>
+            </w:pPr>
+            <w:r>
+              <w:rPr>
+                <w:b w:val="0"/>
+                <w:sz w:val="18"/>
+              </w:rPr>
+              <w:t>1.00</w:t>
+            </w:r>
+          </w:p>
+        </w:tc>
+        <w:tc>
+          <w:tcPr>
+            <w:tcW w:type="dxa" w:w="1234"/>
+            <w:shd w:val="clear" w:color="auto" w:fill="F2F7FF"/>
+          </w:tcPr>
+          <w:p>
+            <w:pPr>
+              <w:jc w:val="center"/>
+            </w:pPr>
+            <w:r>
+              <w:rPr>
+                <w:b w:val="0"/>
+                <w:sz w:val="18"/>
+              </w:rPr>
+              <w:t>1.00</w:t>
+            </w:r>
+          </w:p>
+        </w:tc>
+        <w:tc>
+          <w:tcPr>
+            <w:tcW w:type="dxa" w:w="1234"/>
+            <w:shd w:val="clear" w:color="auto" w:fill="F2F7FF"/>
+          </w:tcPr>
+          <w:p>
+            <w:pPr>
+              <w:jc w:val="center"/>
+            </w:pPr>
+            <w:r>
+              <w:rPr>
+                <w:b w:val="0"/>
+                <w:sz w:val="18"/>
+              </w:rPr>
+              <w:t>1.00</w:t>
+            </w:r>
+          </w:p>
+        </w:tc>
+        <w:tc>
+          <w:tcPr>
+            <w:tcW w:type="dxa" w:w="1234"/>
+            <w:shd w:val="clear" w:color="auto" w:fill="F2F7FF"/>
+          </w:tcPr>
+          <w:p>
+            <w:pPr>
+              <w:jc w:val="center"/>
+            </w:pPr>
+            <w:r>
+              <w:rPr>
+                <w:b w:val="0"/>
+                <w:color w:val="007050"/>
+                <w:sz w:val="18"/>
+              </w:rPr>
+              <w:t>1.00</w:t>
+            </w:r>
+          </w:p>
+        </w:tc>
+        <w:tc>
+          <w:tcPr>
+            <w:tcW w:type="dxa" w:w="1234"/>
+            <w:shd w:val="clear" w:color="auto" w:fill="F2F7FF"/>
+          </w:tcPr>
+          <w:p>
+            <w:pPr>
+              <w:jc w:val="center"/>
+            </w:pPr>
+            <w:r>
+              <w:rPr>
+                <w:b/>
+                <w:color w:val="007050"/>
+                <w:sz w:val="18"/>
+              </w:rPr>
+              <w:t>✓</w:t>
+            </w:r>
+          </w:p>
+        </w:tc>
+      </w:tr>
+      <w:tr>
+        <w:tc>
+          <w:tcPr>
+            <w:tcW w:type="dxa" w:w="1234"/>
+          </w:tcPr>
+          <w:p>
+            <w:pPr>
+              <w:jc w:val="center"/>
+            </w:pPr>
+            <w:r>
+              <w:rPr>
+                <w:b w:val="0"/>
+                <w:sz w:val="18"/>
+              </w:rPr>
+              <w:t>5</w:t>
+            </w:r>
+          </w:p>
+        </w:tc>
+        <w:tc>
+          <w:tcPr>
+            <w:tcW w:type="dxa" w:w="1234"/>
+          </w:tcPr>
+          <w:p>
+            <w:pPr>
+              <w:jc w:val="left"/>
+            </w:pPr>
+            <w:r>
+              <w:rPr>
+                <w:b w:val="0"/>
+                <w:sz w:val="18"/>
+              </w:rPr>
+              <w:t>complete</w:t>
+            </w:r>
+          </w:p>
+        </w:tc>
+        <w:tc>
+          <w:tcPr>
+            <w:tcW w:type="dxa" w:w="1234"/>
+          </w:tcPr>
+          <w:p>
+            <w:pPr>
+              <w:jc w:val="center"/>
+            </w:pPr>
+            <w:r>
+              <w:rPr>
+                <w:b w:val="0"/>
+                <w:sz w:val="18"/>
+              </w:rPr>
+              <w:t>1.00</w:t>
+            </w:r>
+          </w:p>
+        </w:tc>
+        <w:tc>
+          <w:tcPr>
+            <w:tcW w:type="dxa" w:w="1234"/>
+          </w:tcPr>
+          <w:p>
+            <w:pPr>
+              <w:jc w:val="center"/>
+            </w:pPr>
+            <w:r>
+              <w:rPr>
+                <w:b w:val="0"/>
+                <w:sz w:val="18"/>
+              </w:rPr>
+              <w:t>1.00</w:t>
+            </w:r>
+          </w:p>
+        </w:tc>
+        <w:tc>
+          <w:tcPr>
+            <w:tcW w:type="dxa" w:w="1234"/>
+          </w:tcPr>
+          <w:p>
+            <w:pPr>
+              <w:jc w:val="center"/>
+            </w:pPr>
+            <w:r>
+              <w:rPr>
+                <w:b w:val="0"/>
+                <w:sz w:val="18"/>
+              </w:rPr>
+              <w:t>1.00</w:t>
+            </w:r>
+          </w:p>
+        </w:tc>
+        <w:tc>
+          <w:tcPr>
+            <w:tcW w:type="dxa" w:w="1234"/>
+          </w:tcPr>
+          <w:p>
+            <w:pPr>
+              <w:jc w:val="center"/>
+            </w:pPr>
+            <w:r>
+              <w:rPr>
+                <w:b w:val="0"/>
+                <w:color w:val="007050"/>
+                <w:sz w:val="18"/>
+              </w:rPr>
+              <w:t>1.00</w:t>
+            </w:r>
+          </w:p>
+        </w:tc>
+        <w:tc>
+          <w:tcPr>
+            <w:tcW w:type="dxa" w:w="1234"/>
+          </w:tcPr>
+          <w:p>
+            <w:pPr>
+              <w:jc w:val="center"/>
+            </w:pPr>
+            <w:r>
+              <w:rPr>
+                <w:b/>
+                <w:color w:val="007050"/>
+                <w:sz w:val="18"/>
+              </w:rPr>
+              <w:t>✓</w:t>
+            </w:r>
+          </w:p>
+        </w:tc>
+      </w:tr>
+    </w:tbl>
+    <w:p/>
+    <w:p/>
+    <w:p>
+      <w:r>
+        <w:t>Fixture: Jest Unit Test Failures   |   Runs: 5/5 passed   |   Overall: 0.900 — Good</w:t>
+      </w:r>
+    </w:p>
+    <w:tbl>
+      <w:tblPr>
+        <w:tblStyle w:val="TableGrid"/>
+        <w:tblW w:type="auto" w:w="0"/>
+        <w:tblLook w:firstColumn="1" w:firstRow="1" w:lastColumn="0" w:lastRow="0" w:noHBand="0" w:noVBand="1" w:val="04A0"/>
+      </w:tblPr>
+      <w:tblGrid>
+        <w:gridCol w:w="4320"/>
+        <w:gridCol w:w="4320"/>
+      </w:tblGrid>
+      <w:tr>
+        <w:tc>
+          <w:tcPr>
+            <w:tcW w:type="dxa" w:w="5040"/>
+            <w:shd w:val="clear" w:color="auto" w:fill="D6E4F7"/>
+          </w:tcPr>
+          <w:p>
+            <w:pPr>
+              <w:jc w:val="center"/>
+            </w:pPr>
+            <w:r>
+              <w:rPr>
+                <w:b/>
+                <w:color w:val="1F3964"/>
+                <w:sz w:val="18"/>
+              </w:rPr>
+              <w:t>Dimension</w:t>
+            </w:r>
+          </w:p>
+        </w:tc>
+        <w:tc>
+          <w:tcPr>
+            <w:tcW w:type="dxa" w:w="2880"/>
+            <w:shd w:val="clear" w:color="auto" w:fill="D6E4F7"/>
+          </w:tcPr>
+          <w:p>
+            <w:pPr>
+              <w:jc w:val="center"/>
+            </w:pPr>
+            <w:r>
+              <w:rPr>
+                <w:b/>
+                <w:color w:val="1F3964"/>
+                <w:sz w:val="18"/>
+              </w:rPr>
+              <w:t>Avg score</w:t>
+            </w:r>
+          </w:p>
+        </w:tc>
+      </w:tr>
+      <w:tr>
+        <w:tc>
+          <w:tcPr>
+            <w:tcW w:type="dxa" w:w="4320"/>
+          </w:tcPr>
+          <w:p>
+            <w:pPr>
+              <w:jc w:val="left"/>
+            </w:pPr>
+            <w:r>
+              <w:rPr>
+                <w:b w:val="0"/>
+                <w:sz w:val="18"/>
+              </w:rPr>
+              <w:t>Keyword Recall (weight 0.40)</w:t>
+            </w:r>
+          </w:p>
+        </w:tc>
+        <w:tc>
+          <w:tcPr>
+            <w:tcW w:type="dxa" w:w="4320"/>
+          </w:tcPr>
+          <w:p>
+            <w:pPr>
+              <w:jc w:val="center"/>
+            </w:pPr>
+            <w:r>
+              <w:rPr>
+                <w:b w:val="0"/>
+                <w:color w:val="BF7F00"/>
+                <w:sz w:val="18"/>
+              </w:rPr>
+              <w:t>0.750 — Fair</w:t>
+            </w:r>
+          </w:p>
+        </w:tc>
+      </w:tr>
+      <w:tr>
+        <w:tc>
+          <w:tcPr>
+            <w:tcW w:type="dxa" w:w="4320"/>
+          </w:tcPr>
+          <w:p>
+            <w:pPr>
+              <w:jc w:val="left"/>
+            </w:pPr>
+            <w:r>
+              <w:rPr>
+                <w:b w:val="0"/>
+                <w:sz w:val="18"/>
+              </w:rPr>
+              <w:t>File Recall (weight 0.35)</w:t>
+            </w:r>
+          </w:p>
+        </w:tc>
+        <w:tc>
+          <w:tcPr>
+            <w:tcW w:type="dxa" w:w="4320"/>
+          </w:tcPr>
+          <w:p>
+            <w:pPr>
+              <w:jc w:val="center"/>
+            </w:pPr>
+            <w:r>
+              <w:rPr>
+                <w:b w:val="0"/>
+                <w:color w:val="007050"/>
+                <w:sz w:val="18"/>
+              </w:rPr>
+              <w:t>1.000 — Excellent</w:t>
+            </w:r>
+          </w:p>
+        </w:tc>
+      </w:tr>
+      <w:tr>
+        <w:tc>
+          <w:tcPr>
+            <w:tcW w:type="dxa" w:w="4320"/>
+          </w:tcPr>
+          <w:p>
+            <w:pPr>
+              <w:jc w:val="left"/>
+            </w:pPr>
+            <w:r>
+              <w:rPr>
+                <w:b w:val="0"/>
+                <w:sz w:val="18"/>
+              </w:rPr>
+              <w:t>Recommendation Recall (weight 0.25)</w:t>
+            </w:r>
+          </w:p>
+        </w:tc>
+        <w:tc>
+          <w:tcPr>
+            <w:tcW w:type="dxa" w:w="4320"/>
+          </w:tcPr>
+          <w:p>
+            <w:pPr>
+              <w:jc w:val="center"/>
+            </w:pPr>
+            <w:r>
+              <w:rPr>
+                <w:b w:val="0"/>
+                <w:color w:val="007050"/>
+                <w:sz w:val="18"/>
+              </w:rPr>
+              <w:t>1.000 — Excellent</w:t>
+            </w:r>
+          </w:p>
+        </w:tc>
+      </w:tr>
+      <w:tr>
+        <w:tc>
+          <w:tcPr>
+            <w:tcW w:type="dxa" w:w="4320"/>
+          </w:tcPr>
+          <w:p>
+            <w:pPr>
+              <w:jc w:val="left"/>
+            </w:pPr>
+            <w:r>
+              <w:rPr>
+                <w:b/>
+                <w:sz w:val="18"/>
+              </w:rPr>
+              <w:t>Overall</w:t>
+            </w:r>
+          </w:p>
+        </w:tc>
+        <w:tc>
+          <w:tcPr>
+            <w:tcW w:type="dxa" w:w="4320"/>
+          </w:tcPr>
+          <w:p>
+            <w:pPr>
+              <w:jc w:val="center"/>
+            </w:pPr>
+            <w:r>
+              <w:rPr>
+                <w:b/>
+                <w:color w:val="007050"/>
+                <w:sz w:val="18"/>
+              </w:rPr>
+              <w:t>0.900 — Good</w:t>
+            </w:r>
+          </w:p>
+        </w:tc>
+      </w:tr>
+    </w:tbl>
+    <w:p/>
+    <w:tbl>
+      <w:tblPr>
+        <w:tblStyle w:val="TableGrid"/>
+        <w:tblW w:type="auto" w:w="0"/>
+        <w:tblLook w:firstColumn="1" w:firstRow="1" w:lastColumn="0" w:lastRow="0" w:noHBand="0" w:noVBand="1" w:val="04A0"/>
+      </w:tblPr>
+      <w:tblGrid>
+        <w:gridCol w:w="1234"/>
+        <w:gridCol w:w="1234"/>
+        <w:gridCol w:w="1234"/>
+        <w:gridCol w:w="1234"/>
+        <w:gridCol w:w="1234"/>
+        <w:gridCol w:w="1234"/>
+        <w:gridCol w:w="1234"/>
+      </w:tblGrid>
+      <w:tr>
+        <w:tc>
+          <w:tcPr>
+            <w:tcW w:type="dxa" w:w="720"/>
+            <w:shd w:val="clear" w:color="auto" w:fill="D6E4F7"/>
+          </w:tcPr>
+          <w:p>
+            <w:pPr>
+              <w:jc w:val="center"/>
+            </w:pPr>
+            <w:r>
+              <w:rPr>
+                <w:b/>
+                <w:color w:val="1F3964"/>
+                <w:sz w:val="18"/>
+              </w:rPr>
+              <w:t>Run</w:t>
+            </w:r>
+          </w:p>
+        </w:tc>
+        <w:tc>
+          <w:tcPr>
+            <w:tcW w:type="dxa" w:w="1440"/>
+            <w:shd w:val="clear" w:color="auto" w:fill="D6E4F7"/>
+          </w:tcPr>
+          <w:p>
+            <w:pPr>
+              <w:jc w:val="center"/>
+            </w:pPr>
+            <w:r>
+              <w:rPr>
+                <w:b/>
+                <w:color w:val="1F3964"/>
+                <w:sz w:val="18"/>
+              </w:rPr>
+              <w:t>Status</w:t>
+            </w:r>
+          </w:p>
+        </w:tc>
+        <w:tc>
+          <w:tcPr>
+            <w:tcW w:type="dxa" w:w="1152"/>
+            <w:shd w:val="clear" w:color="auto" w:fill="D6E4F7"/>
+          </w:tcPr>
+          <w:p>
+            <w:pPr>
+              <w:jc w:val="center"/>
+            </w:pPr>
+            <w:r>
+              <w:rPr>
+                <w:b/>
+                <w:color w:val="1F3964"/>
+                <w:sz w:val="18"/>
+              </w:rPr>
+              <w:t>keyword</w:t>
+            </w:r>
+          </w:p>
+        </w:tc>
+        <w:tc>
+          <w:tcPr>
+            <w:tcW w:type="dxa" w:w="1008"/>
+            <w:shd w:val="clear" w:color="auto" w:fill="D6E4F7"/>
+          </w:tcPr>
+          <w:p>
+            <w:pPr>
+              <w:jc w:val="center"/>
+            </w:pPr>
+            <w:r>
+              <w:rPr>
+                <w:b/>
+                <w:color w:val="1F3964"/>
+                <w:sz w:val="18"/>
+              </w:rPr>
+              <w:t>file</w:t>
+            </w:r>
+          </w:p>
+        </w:tc>
+        <w:tc>
+          <w:tcPr>
+            <w:tcW w:type="dxa" w:w="1008"/>
+            <w:shd w:val="clear" w:color="auto" w:fill="D6E4F7"/>
+          </w:tcPr>
+          <w:p>
+            <w:pPr>
+              <w:jc w:val="center"/>
+            </w:pPr>
+            <w:r>
+              <w:rPr>
+                <w:b/>
+                <w:color w:val="1F3964"/>
+                <w:sz w:val="18"/>
+              </w:rPr>
+              <w:t>rec</w:t>
+            </w:r>
+          </w:p>
+        </w:tc>
+        <w:tc>
+          <w:tcPr>
+            <w:tcW w:type="dxa" w:w="1296"/>
+            <w:shd w:val="clear" w:color="auto" w:fill="D6E4F7"/>
+          </w:tcPr>
+          <w:p>
+            <w:pPr>
+              <w:jc w:val="center"/>
+            </w:pPr>
+            <w:r>
+              <w:rPr>
+                <w:b/>
+                <w:color w:val="1F3964"/>
+                <w:sz w:val="18"/>
+              </w:rPr>
+              <w:t>overall</w:t>
+            </w:r>
+          </w:p>
+        </w:tc>
+        <w:tc>
+          <w:tcPr>
+            <w:tcW w:type="dxa" w:w="720"/>
+            <w:shd w:val="clear" w:color="auto" w:fill="D6E4F7"/>
+          </w:tcPr>
+          <w:p>
+            <w:pPr>
+              <w:jc w:val="center"/>
+            </w:pPr>
+            <w:r>
+              <w:rPr>
+                <w:b/>
+                <w:color w:val="1F3964"/>
+                <w:sz w:val="18"/>
+              </w:rPr>
+              <w:t>Pass</w:t>
+            </w:r>
+          </w:p>
+        </w:tc>
+      </w:tr>
+      <w:tr>
+        <w:tc>
+          <w:tcPr>
+            <w:tcW w:type="dxa" w:w="1234"/>
+          </w:tcPr>
+          <w:p>
+            <w:pPr>
+              <w:jc w:val="center"/>
+            </w:pPr>
+            <w:r>
+              <w:rPr>
+                <w:b w:val="0"/>
+                <w:sz w:val="18"/>
+              </w:rPr>
+              <w:t>1</w:t>
+            </w:r>
+          </w:p>
+        </w:tc>
+        <w:tc>
+          <w:tcPr>
+            <w:tcW w:type="dxa" w:w="1234"/>
+          </w:tcPr>
+          <w:p>
+            <w:pPr>
+              <w:jc w:val="left"/>
+            </w:pPr>
+            <w:r>
+              <w:rPr>
+                <w:b w:val="0"/>
+                <w:sz w:val="18"/>
+              </w:rPr>
+              <w:t>complete</w:t>
+            </w:r>
+          </w:p>
+        </w:tc>
+        <w:tc>
+          <w:tcPr>
+            <w:tcW w:type="dxa" w:w="1234"/>
+          </w:tcPr>
+          <w:p>
+            <w:pPr>
+              <w:jc w:val="center"/>
+            </w:pPr>
+            <w:r>
+              <w:rPr>
+                <w:b w:val="0"/>
+                <w:sz w:val="18"/>
+              </w:rPr>
+              <w:t>0.75</w:t>
+            </w:r>
+          </w:p>
+        </w:tc>
+        <w:tc>
+          <w:tcPr>
+            <w:tcW w:type="dxa" w:w="1234"/>
+          </w:tcPr>
+          <w:p>
+            <w:pPr>
+              <w:jc w:val="center"/>
+            </w:pPr>
+            <w:r>
+              <w:rPr>
+                <w:b w:val="0"/>
+                <w:sz w:val="18"/>
+              </w:rPr>
+              <w:t>1.00</w:t>
+            </w:r>
+          </w:p>
+        </w:tc>
+        <w:tc>
+          <w:tcPr>
+            <w:tcW w:type="dxa" w:w="1234"/>
+          </w:tcPr>
+          <w:p>
+            <w:pPr>
+              <w:jc w:val="center"/>
+            </w:pPr>
+            <w:r>
+              <w:rPr>
+                <w:b w:val="0"/>
+                <w:sz w:val="18"/>
+              </w:rPr>
+              <w:t>1.00</w:t>
+            </w:r>
+          </w:p>
+        </w:tc>
+        <w:tc>
+          <w:tcPr>
+            <w:tcW w:type="dxa" w:w="1234"/>
+          </w:tcPr>
+          <w:p>
+            <w:pPr>
+              <w:jc w:val="center"/>
+            </w:pPr>
+            <w:r>
+              <w:rPr>
+                <w:b w:val="0"/>
+                <w:color w:val="007050"/>
+                <w:sz w:val="18"/>
+              </w:rPr>
+              <w:t>0.90</w:t>
             </w:r>
           </w:p>
         </w:tc>
@@ -3854,1053 +4832,7 @@
         <w:rPr>
           <w:color w:val="BF7F00"/>
         </w:rPr>
-        <w:t xml:space="preserve">  • 'ComponentX' — missed 3/5 runs</w:t>
-      </w:r>
-    </w:p>
-    <w:p>
-      <w:r>
-        <w:rPr>
-          <w:color w:val="BF7F00"/>
-        </w:rPr>
-        <w:t xml:space="preserve">  • 'type mismatch' — missed 1/5 runs</w:t>
-      </w:r>
-    </w:p>
-    <w:p/>
-    <w:p>
-      <w:r>
-        <w:t>Fixture: Jest Unit Test Failures   |   Runs: 5/5 passed   |   Overall: 0.825 — Good</w:t>
-      </w:r>
-    </w:p>
-    <w:tbl>
-      <w:tblPr>
-        <w:tblStyle w:val="TableGrid"/>
-        <w:tblW w:type="auto" w:w="0"/>
-        <w:tblLook w:firstColumn="1" w:firstRow="1" w:lastColumn="0" w:lastRow="0" w:noHBand="0" w:noVBand="1" w:val="04A0"/>
-      </w:tblPr>
-      <w:tblGrid>
-        <w:gridCol w:w="4320"/>
-        <w:gridCol w:w="4320"/>
-      </w:tblGrid>
-      <w:tr>
-        <w:tc>
-          <w:tcPr>
-            <w:tcW w:type="dxa" w:w="5040"/>
-            <w:shd w:val="clear" w:color="auto" w:fill="D6E4F7"/>
-          </w:tcPr>
-          <w:p>
-            <w:pPr>
-              <w:jc w:val="center"/>
-            </w:pPr>
-            <w:r>
-              <w:rPr>
-                <w:b/>
-                <w:color w:val="1F3964"/>
-                <w:sz w:val="18"/>
-              </w:rPr>
-              <w:t>Dimension</w:t>
-            </w:r>
-          </w:p>
-        </w:tc>
-        <w:tc>
-          <w:tcPr>
-            <w:tcW w:type="dxa" w:w="2880"/>
-            <w:shd w:val="clear" w:color="auto" w:fill="D6E4F7"/>
-          </w:tcPr>
-          <w:p>
-            <w:pPr>
-              <w:jc w:val="center"/>
-            </w:pPr>
-            <w:r>
-              <w:rPr>
-                <w:b/>
-                <w:color w:val="1F3964"/>
-                <w:sz w:val="18"/>
-              </w:rPr>
-              <w:t>Avg score</w:t>
-            </w:r>
-          </w:p>
-        </w:tc>
-      </w:tr>
-      <w:tr>
-        <w:tc>
-          <w:tcPr>
-            <w:tcW w:type="dxa" w:w="4320"/>
-          </w:tcPr>
-          <w:p>
-            <w:pPr>
-              <w:jc w:val="left"/>
-            </w:pPr>
-            <w:r>
-              <w:rPr>
-                <w:b w:val="0"/>
-                <w:sz w:val="18"/>
-              </w:rPr>
-              <w:t>Keyword Recall (weight 0.40)</w:t>
-            </w:r>
-          </w:p>
-        </w:tc>
-        <w:tc>
-          <w:tcPr>
-            <w:tcW w:type="dxa" w:w="4320"/>
-          </w:tcPr>
-          <w:p>
-            <w:pPr>
-              <w:jc w:val="center"/>
-            </w:pPr>
-            <w:r>
-              <w:rPr>
-                <w:b w:val="0"/>
-                <w:color w:val="BF7F00"/>
-                <w:sz w:val="18"/>
-              </w:rPr>
-              <w:t>0.750 — Fair</w:t>
-            </w:r>
-          </w:p>
-        </w:tc>
-      </w:tr>
-      <w:tr>
-        <w:tc>
-          <w:tcPr>
-            <w:tcW w:type="dxa" w:w="4320"/>
-          </w:tcPr>
-          <w:p>
-            <w:pPr>
-              <w:jc w:val="left"/>
-            </w:pPr>
-            <w:r>
-              <w:rPr>
-                <w:b w:val="0"/>
-                <w:sz w:val="18"/>
-              </w:rPr>
-              <w:t>File Recall (weight 0.35)</w:t>
-            </w:r>
-          </w:p>
-        </w:tc>
-        <w:tc>
-          <w:tcPr>
-            <w:tcW w:type="dxa" w:w="4320"/>
-          </w:tcPr>
-          <w:p>
-            <w:pPr>
-              <w:jc w:val="center"/>
-            </w:pPr>
-            <w:r>
-              <w:rPr>
-                <w:b w:val="0"/>
-                <w:color w:val="007050"/>
-                <w:sz w:val="18"/>
-              </w:rPr>
-              <w:t>1.000 — Excellent</w:t>
-            </w:r>
-          </w:p>
-        </w:tc>
-      </w:tr>
-      <w:tr>
-        <w:tc>
-          <w:tcPr>
-            <w:tcW w:type="dxa" w:w="4320"/>
-          </w:tcPr>
-          <w:p>
-            <w:pPr>
-              <w:jc w:val="left"/>
-            </w:pPr>
-            <w:r>
-              <w:rPr>
-                <w:b w:val="0"/>
-                <w:sz w:val="18"/>
-              </w:rPr>
-              <w:t>Recommendation Recall (weight 0.25)</w:t>
-            </w:r>
-          </w:p>
-        </w:tc>
-        <w:tc>
-          <w:tcPr>
-            <w:tcW w:type="dxa" w:w="4320"/>
-          </w:tcPr>
-          <w:p>
-            <w:pPr>
-              <w:jc w:val="center"/>
-            </w:pPr>
-            <w:r>
-              <w:rPr>
-                <w:b w:val="0"/>
-                <w:color w:val="BF7F00"/>
-                <w:sz w:val="18"/>
-              </w:rPr>
-              <w:t>0.700 — Fair</w:t>
-            </w:r>
-          </w:p>
-        </w:tc>
-      </w:tr>
-      <w:tr>
-        <w:tc>
-          <w:tcPr>
-            <w:tcW w:type="dxa" w:w="4320"/>
-          </w:tcPr>
-          <w:p>
-            <w:pPr>
-              <w:jc w:val="left"/>
-            </w:pPr>
-            <w:r>
-              <w:rPr>
-                <w:b/>
-                <w:sz w:val="18"/>
-              </w:rPr>
-              <w:t>Overall</w:t>
-            </w:r>
-          </w:p>
-        </w:tc>
-        <w:tc>
-          <w:tcPr>
-            <w:tcW w:type="dxa" w:w="4320"/>
-          </w:tcPr>
-          <w:p>
-            <w:pPr>
-              <w:jc w:val="center"/>
-            </w:pPr>
-            <w:r>
-              <w:rPr>
-                <w:b/>
-                <w:color w:val="007050"/>
-                <w:sz w:val="18"/>
-              </w:rPr>
-              <w:t>0.825 — Good</w:t>
-            </w:r>
-          </w:p>
-        </w:tc>
-      </w:tr>
-    </w:tbl>
-    <w:p/>
-    <w:tbl>
-      <w:tblPr>
-        <w:tblStyle w:val="TableGrid"/>
-        <w:tblW w:type="auto" w:w="0"/>
-        <w:tblLook w:firstColumn="1" w:firstRow="1" w:lastColumn="0" w:lastRow="0" w:noHBand="0" w:noVBand="1" w:val="04A0"/>
-      </w:tblPr>
-      <w:tblGrid>
-        <w:gridCol w:w="1234"/>
-        <w:gridCol w:w="1234"/>
-        <w:gridCol w:w="1234"/>
-        <w:gridCol w:w="1234"/>
-        <w:gridCol w:w="1234"/>
-        <w:gridCol w:w="1234"/>
-        <w:gridCol w:w="1234"/>
-      </w:tblGrid>
-      <w:tr>
-        <w:tc>
-          <w:tcPr>
-            <w:tcW w:type="dxa" w:w="720"/>
-            <w:shd w:val="clear" w:color="auto" w:fill="D6E4F7"/>
-          </w:tcPr>
-          <w:p>
-            <w:pPr>
-              <w:jc w:val="center"/>
-            </w:pPr>
-            <w:r>
-              <w:rPr>
-                <w:b/>
-                <w:color w:val="1F3964"/>
-                <w:sz w:val="18"/>
-              </w:rPr>
-              <w:t>Run</w:t>
-            </w:r>
-          </w:p>
-        </w:tc>
-        <w:tc>
-          <w:tcPr>
-            <w:tcW w:type="dxa" w:w="1440"/>
-            <w:shd w:val="clear" w:color="auto" w:fill="D6E4F7"/>
-          </w:tcPr>
-          <w:p>
-            <w:pPr>
-              <w:jc w:val="center"/>
-            </w:pPr>
-            <w:r>
-              <w:rPr>
-                <w:b/>
-                <w:color w:val="1F3964"/>
-                <w:sz w:val="18"/>
-              </w:rPr>
-              <w:t>Status</w:t>
-            </w:r>
-          </w:p>
-        </w:tc>
-        <w:tc>
-          <w:tcPr>
-            <w:tcW w:type="dxa" w:w="1152"/>
-            <w:shd w:val="clear" w:color="auto" w:fill="D6E4F7"/>
-          </w:tcPr>
-          <w:p>
-            <w:pPr>
-              <w:jc w:val="center"/>
-            </w:pPr>
-            <w:r>
-              <w:rPr>
-                <w:b/>
-                <w:color w:val="1F3964"/>
-                <w:sz w:val="18"/>
-              </w:rPr>
-              <w:t>keyword</w:t>
-            </w:r>
-          </w:p>
-        </w:tc>
-        <w:tc>
-          <w:tcPr>
-            <w:tcW w:type="dxa" w:w="1008"/>
-            <w:shd w:val="clear" w:color="auto" w:fill="D6E4F7"/>
-          </w:tcPr>
-          <w:p>
-            <w:pPr>
-              <w:jc w:val="center"/>
-            </w:pPr>
-            <w:r>
-              <w:rPr>
-                <w:b/>
-                <w:color w:val="1F3964"/>
-                <w:sz w:val="18"/>
-              </w:rPr>
-              <w:t>file</w:t>
-            </w:r>
-          </w:p>
-        </w:tc>
-        <w:tc>
-          <w:tcPr>
-            <w:tcW w:type="dxa" w:w="1008"/>
-            <w:shd w:val="clear" w:color="auto" w:fill="D6E4F7"/>
-          </w:tcPr>
-          <w:p>
-            <w:pPr>
-              <w:jc w:val="center"/>
-            </w:pPr>
-            <w:r>
-              <w:rPr>
-                <w:b/>
-                <w:color w:val="1F3964"/>
-                <w:sz w:val="18"/>
-              </w:rPr>
-              <w:t>rec</w:t>
-            </w:r>
-          </w:p>
-        </w:tc>
-        <w:tc>
-          <w:tcPr>
-            <w:tcW w:type="dxa" w:w="1296"/>
-            <w:shd w:val="clear" w:color="auto" w:fill="D6E4F7"/>
-          </w:tcPr>
-          <w:p>
-            <w:pPr>
-              <w:jc w:val="center"/>
-            </w:pPr>
-            <w:r>
-              <w:rPr>
-                <w:b/>
-                <w:color w:val="1F3964"/>
-                <w:sz w:val="18"/>
-              </w:rPr>
-              <w:t>overall</w:t>
-            </w:r>
-          </w:p>
-        </w:tc>
-        <w:tc>
-          <w:tcPr>
-            <w:tcW w:type="dxa" w:w="720"/>
-            <w:shd w:val="clear" w:color="auto" w:fill="D6E4F7"/>
-          </w:tcPr>
-          <w:p>
-            <w:pPr>
-              <w:jc w:val="center"/>
-            </w:pPr>
-            <w:r>
-              <w:rPr>
-                <w:b/>
-                <w:color w:val="1F3964"/>
-                <w:sz w:val="18"/>
-              </w:rPr>
-              <w:t>Pass</w:t>
-            </w:r>
-          </w:p>
-        </w:tc>
-      </w:tr>
-      <w:tr>
-        <w:tc>
-          <w:tcPr>
-            <w:tcW w:type="dxa" w:w="1234"/>
-          </w:tcPr>
-          <w:p>
-            <w:pPr>
-              <w:jc w:val="center"/>
-            </w:pPr>
-            <w:r>
-              <w:rPr>
-                <w:b w:val="0"/>
-                <w:sz w:val="18"/>
-              </w:rPr>
-              <w:t>1</w:t>
-            </w:r>
-          </w:p>
-        </w:tc>
-        <w:tc>
-          <w:tcPr>
-            <w:tcW w:type="dxa" w:w="1234"/>
-          </w:tcPr>
-          <w:p>
-            <w:pPr>
-              <w:jc w:val="left"/>
-            </w:pPr>
-            <w:r>
-              <w:rPr>
-                <w:b w:val="0"/>
-                <w:sz w:val="18"/>
-              </w:rPr>
-              <w:t>complete</w:t>
-            </w:r>
-          </w:p>
-        </w:tc>
-        <w:tc>
-          <w:tcPr>
-            <w:tcW w:type="dxa" w:w="1234"/>
-          </w:tcPr>
-          <w:p>
-            <w:pPr>
-              <w:jc w:val="center"/>
-            </w:pPr>
-            <w:r>
-              <w:rPr>
-                <w:b w:val="0"/>
-                <w:sz w:val="18"/>
-              </w:rPr>
-              <w:t>0.75</w:t>
-            </w:r>
-          </w:p>
-        </w:tc>
-        <w:tc>
-          <w:tcPr>
-            <w:tcW w:type="dxa" w:w="1234"/>
-          </w:tcPr>
-          <w:p>
-            <w:pPr>
-              <w:jc w:val="center"/>
-            </w:pPr>
-            <w:r>
-              <w:rPr>
-                <w:b w:val="0"/>
-                <w:sz w:val="18"/>
-              </w:rPr>
-              <w:t>1.00</w:t>
-            </w:r>
-          </w:p>
-        </w:tc>
-        <w:tc>
-          <w:tcPr>
-            <w:tcW w:type="dxa" w:w="1234"/>
-          </w:tcPr>
-          <w:p>
-            <w:pPr>
-              <w:jc w:val="center"/>
-            </w:pPr>
-            <w:r>
-              <w:rPr>
-                <w:b w:val="0"/>
-                <w:sz w:val="18"/>
-              </w:rPr>
-              <w:t>0.50</w:t>
-            </w:r>
-          </w:p>
-        </w:tc>
-        <w:tc>
-          <w:tcPr>
-            <w:tcW w:type="dxa" w:w="1234"/>
-          </w:tcPr>
-          <w:p>
-            <w:pPr>
-              <w:jc w:val="center"/>
-            </w:pPr>
-            <w:r>
-              <w:rPr>
-                <w:b w:val="0"/>
-                <w:color w:val="BF7F00"/>
-                <w:sz w:val="18"/>
-              </w:rPr>
-              <w:t>0.78</w:t>
-            </w:r>
-          </w:p>
-        </w:tc>
-        <w:tc>
-          <w:tcPr>
-            <w:tcW w:type="dxa" w:w="1234"/>
-          </w:tcPr>
-          <w:p>
-            <w:pPr>
-              <w:jc w:val="center"/>
-            </w:pPr>
-            <w:r>
-              <w:rPr>
-                <w:b/>
-                <w:color w:val="007050"/>
-                <w:sz w:val="18"/>
-              </w:rPr>
-              <w:t>✓</w:t>
-            </w:r>
-          </w:p>
-        </w:tc>
-      </w:tr>
-      <w:tr>
-        <w:tc>
-          <w:tcPr>
-            <w:tcW w:type="dxa" w:w="1234"/>
-            <w:shd w:val="clear" w:color="auto" w:fill="F2F7FF"/>
-          </w:tcPr>
-          <w:p>
-            <w:pPr>
-              <w:jc w:val="center"/>
-            </w:pPr>
-            <w:r>
-              <w:rPr>
-                <w:b w:val="0"/>
-                <w:sz w:val="18"/>
-              </w:rPr>
-              <w:t>2</w:t>
-            </w:r>
-          </w:p>
-        </w:tc>
-        <w:tc>
-          <w:tcPr>
-            <w:tcW w:type="dxa" w:w="1234"/>
-            <w:shd w:val="clear" w:color="auto" w:fill="F2F7FF"/>
-          </w:tcPr>
-          <w:p>
-            <w:pPr>
-              <w:jc w:val="left"/>
-            </w:pPr>
-            <w:r>
-              <w:rPr>
-                <w:b w:val="0"/>
-                <w:sz w:val="18"/>
-              </w:rPr>
-              <w:t>complete</w:t>
-            </w:r>
-          </w:p>
-        </w:tc>
-        <w:tc>
-          <w:tcPr>
-            <w:tcW w:type="dxa" w:w="1234"/>
-            <w:shd w:val="clear" w:color="auto" w:fill="F2F7FF"/>
-          </w:tcPr>
-          <w:p>
-            <w:pPr>
-              <w:jc w:val="center"/>
-            </w:pPr>
-            <w:r>
-              <w:rPr>
-                <w:b w:val="0"/>
-                <w:sz w:val="18"/>
-              </w:rPr>
-              <w:t>0.75</w:t>
-            </w:r>
-          </w:p>
-        </w:tc>
-        <w:tc>
-          <w:tcPr>
-            <w:tcW w:type="dxa" w:w="1234"/>
-            <w:shd w:val="clear" w:color="auto" w:fill="F2F7FF"/>
-          </w:tcPr>
-          <w:p>
-            <w:pPr>
-              <w:jc w:val="center"/>
-            </w:pPr>
-            <w:r>
-              <w:rPr>
-                <w:b w:val="0"/>
-                <w:sz w:val="18"/>
-              </w:rPr>
-              <w:t>1.00</w:t>
-            </w:r>
-          </w:p>
-        </w:tc>
-        <w:tc>
-          <w:tcPr>
-            <w:tcW w:type="dxa" w:w="1234"/>
-            <w:shd w:val="clear" w:color="auto" w:fill="F2F7FF"/>
-          </w:tcPr>
-          <w:p>
-            <w:pPr>
-              <w:jc w:val="center"/>
-            </w:pPr>
-            <w:r>
-              <w:rPr>
-                <w:b w:val="0"/>
-                <w:sz w:val="18"/>
-              </w:rPr>
-              <w:t>0.50</w:t>
-            </w:r>
-          </w:p>
-        </w:tc>
-        <w:tc>
-          <w:tcPr>
-            <w:tcW w:type="dxa" w:w="1234"/>
-            <w:shd w:val="clear" w:color="auto" w:fill="F2F7FF"/>
-          </w:tcPr>
-          <w:p>
-            <w:pPr>
-              <w:jc w:val="center"/>
-            </w:pPr>
-            <w:r>
-              <w:rPr>
-                <w:b w:val="0"/>
-                <w:color w:val="BF7F00"/>
-                <w:sz w:val="18"/>
-              </w:rPr>
-              <w:t>0.78</w:t>
-            </w:r>
-          </w:p>
-        </w:tc>
-        <w:tc>
-          <w:tcPr>
-            <w:tcW w:type="dxa" w:w="1234"/>
-            <w:shd w:val="clear" w:color="auto" w:fill="F2F7FF"/>
-          </w:tcPr>
-          <w:p>
-            <w:pPr>
-              <w:jc w:val="center"/>
-            </w:pPr>
-            <w:r>
-              <w:rPr>
-                <w:b/>
-                <w:color w:val="007050"/>
-                <w:sz w:val="18"/>
-              </w:rPr>
-              <w:t>✓</w:t>
-            </w:r>
-          </w:p>
-        </w:tc>
-      </w:tr>
-      <w:tr>
-        <w:tc>
-          <w:tcPr>
-            <w:tcW w:type="dxa" w:w="1234"/>
-          </w:tcPr>
-          <w:p>
-            <w:pPr>
-              <w:jc w:val="center"/>
-            </w:pPr>
-            <w:r>
-              <w:rPr>
-                <w:b w:val="0"/>
-                <w:sz w:val="18"/>
-              </w:rPr>
-              <w:t>3</w:t>
-            </w:r>
-          </w:p>
-        </w:tc>
-        <w:tc>
-          <w:tcPr>
-            <w:tcW w:type="dxa" w:w="1234"/>
-          </w:tcPr>
-          <w:p>
-            <w:pPr>
-              <w:jc w:val="left"/>
-            </w:pPr>
-            <w:r>
-              <w:rPr>
-                <w:b w:val="0"/>
-                <w:sz w:val="18"/>
-              </w:rPr>
-              <w:t>complete</w:t>
-            </w:r>
-          </w:p>
-        </w:tc>
-        <w:tc>
-          <w:tcPr>
-            <w:tcW w:type="dxa" w:w="1234"/>
-          </w:tcPr>
-          <w:p>
-            <w:pPr>
-              <w:jc w:val="center"/>
-            </w:pPr>
-            <w:r>
-              <w:rPr>
-                <w:b w:val="0"/>
-                <w:sz w:val="18"/>
-              </w:rPr>
-              <w:t>0.75</w:t>
-            </w:r>
-          </w:p>
-        </w:tc>
-        <w:tc>
-          <w:tcPr>
-            <w:tcW w:type="dxa" w:w="1234"/>
-          </w:tcPr>
-          <w:p>
-            <w:pPr>
-              <w:jc w:val="center"/>
-            </w:pPr>
-            <w:r>
-              <w:rPr>
-                <w:b w:val="0"/>
-                <w:sz w:val="18"/>
-              </w:rPr>
-              <w:t>1.00</w:t>
-            </w:r>
-          </w:p>
-        </w:tc>
-        <w:tc>
-          <w:tcPr>
-            <w:tcW w:type="dxa" w:w="1234"/>
-          </w:tcPr>
-          <w:p>
-            <w:pPr>
-              <w:jc w:val="center"/>
-            </w:pPr>
-            <w:r>
-              <w:rPr>
-                <w:b w:val="0"/>
-                <w:sz w:val="18"/>
-              </w:rPr>
-              <w:t>1.00</w:t>
-            </w:r>
-          </w:p>
-        </w:tc>
-        <w:tc>
-          <w:tcPr>
-            <w:tcW w:type="dxa" w:w="1234"/>
-          </w:tcPr>
-          <w:p>
-            <w:pPr>
-              <w:jc w:val="center"/>
-            </w:pPr>
-            <w:r>
-              <w:rPr>
-                <w:b w:val="0"/>
-                <w:color w:val="007050"/>
-                <w:sz w:val="18"/>
-              </w:rPr>
-              <w:t>0.90</w:t>
-            </w:r>
-          </w:p>
-        </w:tc>
-        <w:tc>
-          <w:tcPr>
-            <w:tcW w:type="dxa" w:w="1234"/>
-          </w:tcPr>
-          <w:p>
-            <w:pPr>
-              <w:jc w:val="center"/>
-            </w:pPr>
-            <w:r>
-              <w:rPr>
-                <w:b/>
-                <w:color w:val="007050"/>
-                <w:sz w:val="18"/>
-              </w:rPr>
-              <w:t>✓</w:t>
-            </w:r>
-          </w:p>
-        </w:tc>
-      </w:tr>
-      <w:tr>
-        <w:tc>
-          <w:tcPr>
-            <w:tcW w:type="dxa" w:w="1234"/>
-            <w:shd w:val="clear" w:color="auto" w:fill="F2F7FF"/>
-          </w:tcPr>
-          <w:p>
-            <w:pPr>
-              <w:jc w:val="center"/>
-            </w:pPr>
-            <w:r>
-              <w:rPr>
-                <w:b w:val="0"/>
-                <w:sz w:val="18"/>
-              </w:rPr>
-              <w:t>4</w:t>
-            </w:r>
-          </w:p>
-        </w:tc>
-        <w:tc>
-          <w:tcPr>
-            <w:tcW w:type="dxa" w:w="1234"/>
-            <w:shd w:val="clear" w:color="auto" w:fill="F2F7FF"/>
-          </w:tcPr>
-          <w:p>
-            <w:pPr>
-              <w:jc w:val="left"/>
-            </w:pPr>
-            <w:r>
-              <w:rPr>
-                <w:b w:val="0"/>
-                <w:sz w:val="18"/>
-              </w:rPr>
-              <w:t>complete</w:t>
-            </w:r>
-          </w:p>
-        </w:tc>
-        <w:tc>
-          <w:tcPr>
-            <w:tcW w:type="dxa" w:w="1234"/>
-            <w:shd w:val="clear" w:color="auto" w:fill="F2F7FF"/>
-          </w:tcPr>
-          <w:p>
-            <w:pPr>
-              <w:jc w:val="center"/>
-            </w:pPr>
-            <w:r>
-              <w:rPr>
-                <w:b w:val="0"/>
-                <w:sz w:val="18"/>
-              </w:rPr>
-              <w:t>0.75</w:t>
-            </w:r>
-          </w:p>
-        </w:tc>
-        <w:tc>
-          <w:tcPr>
-            <w:tcW w:type="dxa" w:w="1234"/>
-            <w:shd w:val="clear" w:color="auto" w:fill="F2F7FF"/>
-          </w:tcPr>
-          <w:p>
-            <w:pPr>
-              <w:jc w:val="center"/>
-            </w:pPr>
-            <w:r>
-              <w:rPr>
-                <w:b w:val="0"/>
-                <w:sz w:val="18"/>
-              </w:rPr>
-              <w:t>1.00</w:t>
-            </w:r>
-          </w:p>
-        </w:tc>
-        <w:tc>
-          <w:tcPr>
-            <w:tcW w:type="dxa" w:w="1234"/>
-            <w:shd w:val="clear" w:color="auto" w:fill="F2F7FF"/>
-          </w:tcPr>
-          <w:p>
-            <w:pPr>
-              <w:jc w:val="center"/>
-            </w:pPr>
-            <w:r>
-              <w:rPr>
-                <w:b w:val="0"/>
-                <w:sz w:val="18"/>
-              </w:rPr>
-              <w:t>0.50</w:t>
-            </w:r>
-          </w:p>
-        </w:tc>
-        <w:tc>
-          <w:tcPr>
-            <w:tcW w:type="dxa" w:w="1234"/>
-            <w:shd w:val="clear" w:color="auto" w:fill="F2F7FF"/>
-          </w:tcPr>
-          <w:p>
-            <w:pPr>
-              <w:jc w:val="center"/>
-            </w:pPr>
-            <w:r>
-              <w:rPr>
-                <w:b w:val="0"/>
-                <w:color w:val="BF7F00"/>
-                <w:sz w:val="18"/>
-              </w:rPr>
-              <w:t>0.78</w:t>
-            </w:r>
-          </w:p>
-        </w:tc>
-        <w:tc>
-          <w:tcPr>
-            <w:tcW w:type="dxa" w:w="1234"/>
-            <w:shd w:val="clear" w:color="auto" w:fill="F2F7FF"/>
-          </w:tcPr>
-          <w:p>
-            <w:pPr>
-              <w:jc w:val="center"/>
-            </w:pPr>
-            <w:r>
-              <w:rPr>
-                <w:b/>
-                <w:color w:val="007050"/>
-                <w:sz w:val="18"/>
-              </w:rPr>
-              <w:t>✓</w:t>
-            </w:r>
-          </w:p>
-        </w:tc>
-      </w:tr>
-      <w:tr>
-        <w:tc>
-          <w:tcPr>
-            <w:tcW w:type="dxa" w:w="1234"/>
-          </w:tcPr>
-          <w:p>
-            <w:pPr>
-              <w:jc w:val="center"/>
-            </w:pPr>
-            <w:r>
-              <w:rPr>
-                <w:b w:val="0"/>
-                <w:sz w:val="18"/>
-              </w:rPr>
-              <w:t>5</w:t>
-            </w:r>
-          </w:p>
-        </w:tc>
-        <w:tc>
-          <w:tcPr>
-            <w:tcW w:type="dxa" w:w="1234"/>
-          </w:tcPr>
-          <w:p>
-            <w:pPr>
-              <w:jc w:val="left"/>
-            </w:pPr>
-            <w:r>
-              <w:rPr>
-                <w:b w:val="0"/>
-                <w:sz w:val="18"/>
-              </w:rPr>
-              <w:t>complete</w:t>
-            </w:r>
-          </w:p>
-        </w:tc>
-        <w:tc>
-          <w:tcPr>
-            <w:tcW w:type="dxa" w:w="1234"/>
-          </w:tcPr>
-          <w:p>
-            <w:pPr>
-              <w:jc w:val="center"/>
-            </w:pPr>
-            <w:r>
-              <w:rPr>
-                <w:b w:val="0"/>
-                <w:sz w:val="18"/>
-              </w:rPr>
-              <w:t>0.75</w:t>
-            </w:r>
-          </w:p>
-        </w:tc>
-        <w:tc>
-          <w:tcPr>
-            <w:tcW w:type="dxa" w:w="1234"/>
-          </w:tcPr>
-          <w:p>
-            <w:pPr>
-              <w:jc w:val="center"/>
-            </w:pPr>
-            <w:r>
-              <w:rPr>
-                <w:b w:val="0"/>
-                <w:sz w:val="18"/>
-              </w:rPr>
-              <w:t>1.00</w:t>
-            </w:r>
-          </w:p>
-        </w:tc>
-        <w:tc>
-          <w:tcPr>
-            <w:tcW w:type="dxa" w:w="1234"/>
-          </w:tcPr>
-          <w:p>
-            <w:pPr>
-              <w:jc w:val="center"/>
-            </w:pPr>
-            <w:r>
-              <w:rPr>
-                <w:b w:val="0"/>
-                <w:sz w:val="18"/>
-              </w:rPr>
-              <w:t>1.00</w:t>
-            </w:r>
-          </w:p>
-        </w:tc>
-        <w:tc>
-          <w:tcPr>
-            <w:tcW w:type="dxa" w:w="1234"/>
-          </w:tcPr>
-          <w:p>
-            <w:pPr>
-              <w:jc w:val="center"/>
-            </w:pPr>
-            <w:r>
-              <w:rPr>
-                <w:b w:val="0"/>
-                <w:color w:val="007050"/>
-                <w:sz w:val="18"/>
-              </w:rPr>
-              <w:t>0.90</w:t>
-            </w:r>
-          </w:p>
-        </w:tc>
-        <w:tc>
-          <w:tcPr>
-            <w:tcW w:type="dxa" w:w="1234"/>
-          </w:tcPr>
-          <w:p>
-            <w:pPr>
-              <w:jc w:val="center"/>
-            </w:pPr>
-            <w:r>
-              <w:rPr>
-                <w:b/>
-                <w:color w:val="007050"/>
-                <w:sz w:val="18"/>
-              </w:rPr>
-              <w:t>✓</w:t>
-            </w:r>
-          </w:p>
-        </w:tc>
-      </w:tr>
-    </w:tbl>
-    <w:p/>
-    <w:p>
-      <w:pPr>
-        <w:pStyle w:val="Heading4"/>
-      </w:pPr>
-      <w:r>
-        <w:rPr>
-          <w:color w:val="1F3964"/>
-        </w:rPr>
-        <w:t>Recall Gaps</w:t>
-      </w:r>
-    </w:p>
-    <w:p>
-      <w:r>
-        <w:rPr>
-          <w:b/>
-        </w:rPr>
-        <w:t>Keywords missed:</w:t>
-      </w:r>
-    </w:p>
-    <w:p>
-      <w:r>
-        <w:rPr>
-          <w:color w:val="BF7F00"/>
-        </w:rPr>
         <w:t xml:space="preserve">  • 'unit' — missed 5/5 runs</w:t>
-      </w:r>
-    </w:p>
-    <w:p>
-      <w:r>
-        <w:rPr>
-          <w:b/>
-        </w:rPr>
-        <w:t>Recommendations missed:</w:t>
-      </w:r>
-    </w:p>
-    <w:p>
-      <w:r>
-        <w:rPr>
-          <w:color w:val="BF7F00"/>
-        </w:rPr>
-        <w:t xml:space="preserve">  • 'fix the undefined run_id' — missed 2/5 runs</w:t>
-      </w:r>
-    </w:p>
-    <w:p>
-      <w:r>
-        <w:rPr>
-          <w:color w:val="BF7F00"/>
-        </w:rPr>
-        <w:t xml:space="preserve">  • 'investigate the 500 response from /analyse/cr' — missed 1/5 runs</w:t>
       </w:r>
     </w:p>
     <w:p/>

</xml_diff>